<commit_message>
Agrega las URL y las capturas del despliegue
</commit_message>
<xml_diff>
--- a/docs/ENTREGABLE.docx
+++ b/docs/ENTREGABLE.docx
@@ -1364,7 +1364,7 @@
       </w:r>
     </w:p>
     <w:bookmarkEnd w:id="66"/>
-    <w:bookmarkStart w:id="67" w:name="despliegue"/>
+    <w:bookmarkStart w:id="76" w:name="despliegue"/>
     <w:p>
       <w:pPr>
         <w:pStyle w:val="Heading2"/>
@@ -1382,7 +1382,7 @@
         </w:numPr>
       </w:pPr>
       <w:r>
-        <w:t xml:space="preserve">Backend: [URL de Render]</w:t>
+        <w:t xml:space="preserve">Backend: https://techstore-api-xb0d.onrender.com</w:t>
       </w:r>
     </w:p>
     <w:p>
@@ -1394,11 +1394,176 @@
         </w:numPr>
       </w:pPr>
       <w:r>
-        <w:t xml:space="preserve">Aplicación web: [URL de Netlify]</w:t>
-      </w:r>
-    </w:p>
-    <w:bookmarkEnd w:id="67"/>
-    <w:bookmarkStart w:id="68" w:name="repositorio"/>
+        <w:t xml:space="preserve">Aplicación web: https://techstore-lab10-fbrzz004.netlify.app</w:t>
+      </w:r>
+    </w:p>
+    <w:p>
+      <w:pPr>
+        <w:pStyle w:val="CaptionedFigure"/>
+      </w:pPr>
+      <w:r>
+        <w:drawing>
+          <wp:inline>
+            <wp:extent cx="5579999" cy="3077299"/>
+            <wp:effectExtent b="0" l="0" r="0" t="0"/>
+            <wp:docPr descr="Ruta /health del backend desplegado" title="" id="68" name="Picture"/>
+            <a:graphic>
+              <a:graphicData uri="http://schemas.openxmlformats.org/drawingml/2006/picture">
+                <pic:pic>
+                  <pic:nvPicPr>
+                    <pic:cNvPr descr="evidencias/19_health.png" id="69" name="Picture"/>
+                    <pic:cNvPicPr>
+                      <a:picLocks noChangeArrowheads="1" noChangeAspect="1"/>
+                    </pic:cNvPicPr>
+                  </pic:nvPicPr>
+                  <pic:blipFill>
+                    <a:blip r:embed="rId67"/>
+                    <a:stretch>
+                      <a:fillRect/>
+                    </a:stretch>
+                  </pic:blipFill>
+                  <pic:spPr bwMode="auto">
+                    <a:xfrm>
+                      <a:off x="0" y="0"/>
+                      <a:ext cx="5579999" cy="3077299"/>
+                    </a:xfrm>
+                    <a:prstGeom prst="rect">
+                      <a:avLst/>
+                    </a:prstGeom>
+                    <a:noFill/>
+                    <a:ln w="9525">
+                      <a:noFill/>
+                      <a:headEnd/>
+                      <a:tailEnd/>
+                    </a:ln>
+                  </pic:spPr>
+                </pic:pic>
+              </a:graphicData>
+            </a:graphic>
+          </wp:inline>
+        </w:drawing>
+      </w:r>
+    </w:p>
+    <w:p>
+      <w:pPr>
+        <w:pStyle w:val="ImageCaption"/>
+      </w:pPr>
+      <w:r>
+        <w:t xml:space="preserve">Ruta /health del backend desplegado</w:t>
+      </w:r>
+    </w:p>
+    <w:p>
+      <w:pPr>
+        <w:pStyle w:val="CaptionedFigure"/>
+      </w:pPr>
+      <w:r>
+        <w:drawing>
+          <wp:inline>
+            <wp:extent cx="2231999" cy="4830276"/>
+            <wp:effectExtent b="0" l="0" r="0" t="0"/>
+            <wp:docPr descr="Aplicación web desplegada" title="" id="71" name="Picture"/>
+            <a:graphic>
+              <a:graphicData uri="http://schemas.openxmlformats.org/drawingml/2006/picture">
+                <pic:pic>
+                  <pic:nvPicPr>
+                    <pic:cNvPr descr="evidencias/21_app_web.png" id="72" name="Picture"/>
+                    <pic:cNvPicPr>
+                      <a:picLocks noChangeArrowheads="1" noChangeAspect="1"/>
+                    </pic:cNvPicPr>
+                  </pic:nvPicPr>
+                  <pic:blipFill>
+                    <a:blip r:embed="rId70"/>
+                    <a:stretch>
+                      <a:fillRect/>
+                    </a:stretch>
+                  </pic:blipFill>
+                  <pic:spPr bwMode="auto">
+                    <a:xfrm>
+                      <a:off x="0" y="0"/>
+                      <a:ext cx="2231999" cy="4830276"/>
+                    </a:xfrm>
+                    <a:prstGeom prst="rect">
+                      <a:avLst/>
+                    </a:prstGeom>
+                    <a:noFill/>
+                    <a:ln w="9525">
+                      <a:noFill/>
+                      <a:headEnd/>
+                      <a:tailEnd/>
+                    </a:ln>
+                  </pic:spPr>
+                </pic:pic>
+              </a:graphicData>
+            </a:graphic>
+          </wp:inline>
+        </w:drawing>
+      </w:r>
+    </w:p>
+    <w:p>
+      <w:pPr>
+        <w:pStyle w:val="ImageCaption"/>
+      </w:pPr>
+      <w:r>
+        <w:t xml:space="preserve">Aplicación web desplegada</w:t>
+      </w:r>
+    </w:p>
+    <w:p>
+      <w:pPr>
+        <w:pStyle w:val="CaptionedFigure"/>
+      </w:pPr>
+      <w:r>
+        <w:drawing>
+          <wp:inline>
+            <wp:extent cx="2231999" cy="4830276"/>
+            <wp:effectExtent b="0" l="0" r="0" t="0"/>
+            <wp:docPr descr="Catálogo desde la aplicación web desplegada" title="" id="74" name="Picture"/>
+            <a:graphic>
+              <a:graphicData uri="http://schemas.openxmlformats.org/drawingml/2006/picture">
+                <pic:pic>
+                  <pic:nvPicPr>
+                    <pic:cNvPr descr="evidencias/22_app_web_catalogo.png" id="75" name="Picture"/>
+                    <pic:cNvPicPr>
+                      <a:picLocks noChangeArrowheads="1" noChangeAspect="1"/>
+                    </pic:cNvPicPr>
+                  </pic:nvPicPr>
+                  <pic:blipFill>
+                    <a:blip r:embed="rId73"/>
+                    <a:stretch>
+                      <a:fillRect/>
+                    </a:stretch>
+                  </pic:blipFill>
+                  <pic:spPr bwMode="auto">
+                    <a:xfrm>
+                      <a:off x="0" y="0"/>
+                      <a:ext cx="2231999" cy="4830276"/>
+                    </a:xfrm>
+                    <a:prstGeom prst="rect">
+                      <a:avLst/>
+                    </a:prstGeom>
+                    <a:noFill/>
+                    <a:ln w="9525">
+                      <a:noFill/>
+                      <a:headEnd/>
+                      <a:tailEnd/>
+                    </a:ln>
+                  </pic:spPr>
+                </pic:pic>
+              </a:graphicData>
+            </a:graphic>
+          </wp:inline>
+        </w:drawing>
+      </w:r>
+    </w:p>
+    <w:p>
+      <w:pPr>
+        <w:pStyle w:val="ImageCaption"/>
+      </w:pPr>
+      <w:r>
+        <w:t xml:space="preserve">Catálogo desde la aplicación web desplegada</w:t>
+      </w:r>
+    </w:p>
+    <w:bookmarkEnd w:id="76"/>
+    <w:bookmarkStart w:id="77" w:name="repositorio"/>
     <w:p>
       <w:pPr>
         <w:pStyle w:val="Heading2"/>
@@ -1415,7 +1580,7 @@
         <w:t xml:space="preserve">https://github.com/fbrzz004/lab10_techstore</w:t>
       </w:r>
     </w:p>
-    <w:bookmarkEnd w:id="68"/>
+    <w:bookmarkEnd w:id="77"/>
     <w:sectPr>
       <w:footnotePr>
         <w:numRestart w:val="eachSect"/>

</xml_diff>

<commit_message>
Mueve las URL al inicio del entregable
</commit_message>
<xml_diff>
--- a/docs/ENTREGABLE.docx
+++ b/docs/ENTREGABLE.docx
@@ -5,6 +5,26 @@
     <w:p>
       <w:pPr>
         <w:pStyle w:val="FirstParagraph"/>
+      </w:pPr>
+      <w:r>
+        <w:t xml:space="preserve">Backend: https://techstore-api-xb0d.onrender.com</w:t>
+      </w:r>
+      <w:r>
+        <w:br/>
+      </w:r>
+      <w:r>
+        <w:t xml:space="preserve">Aplicación web: https://techstore-lab10-fbrzz004.netlify.app</w:t>
+      </w:r>
+      <w:r>
+        <w:br/>
+      </w:r>
+      <w:r>
+        <w:t xml:space="preserve">Repositorio: https://github.com/fbrzz004/lab10_techstore</w:t>
+      </w:r>
+    </w:p>
+    <w:p>
+      <w:pPr>
+        <w:pStyle w:val="BodyText"/>
       </w:pPr>
       <w:r>
         <w:t xml:space="preserve">Curso: Taller de construcción de software móvil</w:t>
@@ -1364,37 +1384,13 @@
       </w:r>
     </w:p>
     <w:bookmarkEnd w:id="66"/>
-    <w:bookmarkStart w:id="76" w:name="despliegue"/>
+    <w:bookmarkStart w:id="76" w:name="capturas-del-despliegue"/>
     <w:p>
       <w:pPr>
         <w:pStyle w:val="Heading2"/>
       </w:pPr>
       <w:r>
-        <w:t xml:space="preserve">Despliegue</w:t>
-      </w:r>
-    </w:p>
-    <w:p>
-      <w:pPr>
-        <w:pStyle w:val="Compact"/>
-        <w:numPr>
-          <w:ilvl w:val="0"/>
-          <w:numId w:val="1003"/>
-        </w:numPr>
-      </w:pPr>
-      <w:r>
-        <w:t xml:space="preserve">Backend: https://techstore-api-xb0d.onrender.com</w:t>
-      </w:r>
-    </w:p>
-    <w:p>
-      <w:pPr>
-        <w:pStyle w:val="Compact"/>
-        <w:numPr>
-          <w:ilvl w:val="0"/>
-          <w:numId w:val="1003"/>
-        </w:numPr>
-      </w:pPr>
-      <w:r>
-        <w:t xml:space="preserve">Aplicación web: https://techstore-lab10-fbrzz004.netlify.app</w:t>
+        <w:t xml:space="preserve">Capturas del despliegue</w:t>
       </w:r>
     </w:p>
     <w:p>
@@ -1563,24 +1559,6 @@
       </w:r>
     </w:p>
     <w:bookmarkEnd w:id="76"/>
-    <w:bookmarkStart w:id="77" w:name="repositorio"/>
-    <w:p>
-      <w:pPr>
-        <w:pStyle w:val="Heading2"/>
-      </w:pPr>
-      <w:r>
-        <w:t xml:space="preserve">Repositorio</w:t>
-      </w:r>
-    </w:p>
-    <w:p>
-      <w:pPr>
-        <w:pStyle w:val="FirstParagraph"/>
-      </w:pPr>
-      <w:r>
-        <w:t xml:space="preserve">https://github.com/fbrzz004/lab10_techstore</w:t>
-      </w:r>
-    </w:p>
-    <w:bookmarkEnd w:id="77"/>
     <w:sectPr>
       <w:footnotePr>
         <w:numRestart w:val="eachSect"/>
@@ -1803,9 +1781,6 @@
     <w:abstractNumId w:val="991"/>
   </w:num>
   <w:num w:numId="1002">
-    <w:abstractNumId w:val="991"/>
-  </w:num>
-  <w:num w:numId="1003">
     <w:abstractNumId w:val="991"/>
   </w:num>
 </w:numbering>

</xml_diff>